<commit_message>
feat: release 1.4.0 - Call Memo 財務預測表格 + 修正 PDF 讀圖幻覺
新增財務狀況的結構化預測表格（16 項會計科目 x Now/Now+1/Now+2/Now+3），支援
兩層收合（整表 + 生產人數/Sales人數/G&A人數/RD人數各自收合的補充明細）、AI 依
補充資料自動填值並去除單位字樣、COGS 等科目辨識常見會計措辭同義詞、表頭改用
實際財報期間取代通用的 Now/Now+1 代稱。

同時修正上一輪 PDF vision 抽取的幻覺問題：整份 PDF 交給 Claude CLI 自己轉圖片，
遇到超長版面畫質被壓低導致人名/學校等專有名詞被誤讀，改成直接抓取沒有文字層
那幾頁的原始內嵌圖片交給模型，畫質等同人眼直接看到的版面。

Co-Authored-By: Claude Sonnet 5 <noreply@anthropic.com>
</commit_message>
<xml_diff>
--- a/data/call_memo_template.docx
+++ b/data/call_memo_template.docx
@@ -1532,7 +1532,7 @@
                       <w:rFonts w:eastAsia="標楷體" w:hint="eastAsia"/>
                       <w:bCs/>
                     </w:rPr>
-                    <w:t>費用</w:t>
+                    <w:t>營業費用</w:t>
                   </w:r>
                 </w:p>
               </w:tc>
@@ -1859,6 +1859,42 @@
             <w:tr>
               <w:tc>
                 <w:tcPr>
+                  <w:tcW w:type="dxa" w:w="1587"/>
+                </w:tcPr>
+                <w:p>
+                  <w:r>
+                    <w:t>G&amp;A人數</w:t>
+                  </w:r>
+                </w:p>
+              </w:tc>
+              <w:tc>
+                <w:tcPr>
+                  <w:tcW w:type="dxa" w:w="791"/>
+                </w:tcPr>
+                <w:p/>
+              </w:tc>
+              <w:tc>
+                <w:tcPr>
+                  <w:tcW w:type="dxa" w:w="964"/>
+                </w:tcPr>
+                <w:p/>
+              </w:tc>
+              <w:tc>
+                <w:tcPr>
+                  <w:tcW w:type="dxa" w:w="964"/>
+                </w:tcPr>
+                <w:p/>
+              </w:tc>
+              <w:tc>
+                <w:tcPr>
+                  <w:tcW w:type="dxa" w:w="964"/>
+                </w:tcPr>
+                <w:p/>
+              </w:tc>
+            </w:tr>
+            <w:tr>
+              <w:tc>
+                <w:tcPr>
                   <w:tcW w:w="1587" w:type="dxa"/>
                 </w:tcPr>
                 <w:p>
@@ -2029,6 +2065,114 @@
                     </w:rPr>
                   </w:pPr>
                 </w:p>
+              </w:tc>
+            </w:tr>
+            <w:tr>
+              <w:tc>
+                <w:tcPr>
+                  <w:tcW w:type="dxa" w:w="1587"/>
+                </w:tcPr>
+                <w:p>
+                  <w:r>
+                    <w:t>營業利益</w:t>
+                  </w:r>
+                </w:p>
+              </w:tc>
+              <w:tc>
+                <w:tcPr>
+                  <w:tcW w:type="dxa" w:w="791"/>
+                </w:tcPr>
+                <w:p/>
+              </w:tc>
+              <w:tc>
+                <w:tcPr>
+                  <w:tcW w:type="dxa" w:w="964"/>
+                </w:tcPr>
+                <w:p/>
+              </w:tc>
+              <w:tc>
+                <w:tcPr>
+                  <w:tcW w:type="dxa" w:w="964"/>
+                </w:tcPr>
+                <w:p/>
+              </w:tc>
+              <w:tc>
+                <w:tcPr>
+                  <w:tcW w:type="dxa" w:w="964"/>
+                </w:tcPr>
+                <w:p/>
+              </w:tc>
+            </w:tr>
+            <w:tr>
+              <w:tc>
+                <w:tcPr>
+                  <w:tcW w:type="dxa" w:w="1587"/>
+                </w:tcPr>
+                <w:p>
+                  <w:r>
+                    <w:t>業外收入</w:t>
+                  </w:r>
+                </w:p>
+              </w:tc>
+              <w:tc>
+                <w:tcPr>
+                  <w:tcW w:type="dxa" w:w="791"/>
+                </w:tcPr>
+                <w:p/>
+              </w:tc>
+              <w:tc>
+                <w:tcPr>
+                  <w:tcW w:type="dxa" w:w="964"/>
+                </w:tcPr>
+                <w:p/>
+              </w:tc>
+              <w:tc>
+                <w:tcPr>
+                  <w:tcW w:type="dxa" w:w="964"/>
+                </w:tcPr>
+                <w:p/>
+              </w:tc>
+              <w:tc>
+                <w:tcPr>
+                  <w:tcW w:type="dxa" w:w="964"/>
+                </w:tcPr>
+                <w:p/>
+              </w:tc>
+            </w:tr>
+            <w:tr>
+              <w:tc>
+                <w:tcPr>
+                  <w:tcW w:type="dxa" w:w="1587"/>
+                </w:tcPr>
+                <w:p>
+                  <w:r>
+                    <w:t>業外支出</w:t>
+                  </w:r>
+                </w:p>
+              </w:tc>
+              <w:tc>
+                <w:tcPr>
+                  <w:tcW w:type="dxa" w:w="791"/>
+                </w:tcPr>
+                <w:p/>
+              </w:tc>
+              <w:tc>
+                <w:tcPr>
+                  <w:tcW w:type="dxa" w:w="964"/>
+                </w:tcPr>
+                <w:p/>
+              </w:tc>
+              <w:tc>
+                <w:tcPr>
+                  <w:tcW w:type="dxa" w:w="964"/>
+                </w:tcPr>
+                <w:p/>
+              </w:tc>
+              <w:tc>
+                <w:tcPr>
+                  <w:tcW w:type="dxa" w:w="964"/>
+                </w:tcPr>
+                <w:p/>
               </w:tc>
             </w:tr>
             <w:tr>

</xml_diff>